<commit_message>
blog shizz & carousel noticiero
</commit_message>
<xml_diff>
--- a/Sprints.docx
+++ b/Sprints.docx
@@ -164,8 +164,16 @@
         <w:rPr>
           <w:strike/>
         </w:rPr>
-        <w:t>Configure Shopify admin and create documentation for client</w:t>
-      </w:r>
+        <w:t xml:space="preserve">Configure Shopify admin and create documentation for </w:t>
+      </w:r>
+      <w:proofErr w:type="gramStart"/>
+      <w:r>
+        <w:rPr>
+          <w:strike/>
+        </w:rPr>
+        <w:t>client</w:t>
+      </w:r>
+      <w:proofErr w:type="gramEnd"/>
     </w:p>
     <w:p>
       <w:pPr>
@@ -370,8 +378,14 @@
           <w:ilvl w:val="0"/>
           <w:numId w:val="4"/>
         </w:numPr>
-      </w:pPr>
-      <w:r>
+        <w:rPr>
+          <w:strike/>
+        </w:rPr>
+      </w:pPr>
+      <w:r>
+        <w:rPr>
+          <w:strike/>
+        </w:rPr>
         <w:t>Integrate Shopify Cart API with frontend</w:t>
       </w:r>
     </w:p>
@@ -421,15 +435,15 @@
           <w:ilvl w:val="0"/>
           <w:numId w:val="4"/>
         </w:numPr>
-      </w:pPr>
-      <w:r>
-        <w:t xml:space="preserve">Create policies pages </w:t>
-      </w:r>
-      <w:r>
-        <w:rPr>
-          <w:strike/>
-        </w:rPr>
-        <w:t>(returns, privacy, terms) in Shopify</w:t>
+        <w:rPr>
+          <w:strike/>
+        </w:rPr>
+      </w:pPr>
+      <w:r>
+        <w:rPr>
+          <w:strike/>
+        </w:rPr>
+        <w:t>Create policies pages (returns, privacy, terms) in Shopify</w:t>
       </w:r>
     </w:p>
     <w:p>
@@ -498,8 +512,14 @@
           <w:ilvl w:val="0"/>
           <w:numId w:val="5"/>
         </w:numPr>
-      </w:pPr>
-      <w:r>
+        <w:rPr>
+          <w:strike/>
+        </w:rPr>
+      </w:pPr>
+      <w:r>
+        <w:rPr>
+          <w:strike/>
+        </w:rPr>
         <w:t>Create MVZ (veterinarian) profile section</w:t>
       </w:r>
     </w:p>
@@ -565,8 +585,14 @@
           <w:ilvl w:val="0"/>
           <w:numId w:val="6"/>
         </w:numPr>
-      </w:pPr>
-      <w:r>
+        <w:rPr>
+          <w:strike/>
+        </w:rPr>
+      </w:pPr>
+      <w:r>
+        <w:rPr>
+          <w:strike/>
+        </w:rPr>
         <w:t>Set up Shopify Blog for news/announcements section</w:t>
       </w:r>
     </w:p>
@@ -576,8 +602,14 @@
           <w:ilvl w:val="0"/>
           <w:numId w:val="6"/>
         </w:numPr>
-      </w:pPr>
-      <w:r>
+        <w:rPr>
+          <w:strike/>
+        </w:rPr>
+      </w:pPr>
+      <w:r>
+        <w:rPr>
+          <w:strike/>
+        </w:rPr>
         <w:t>Create blog listing and detail page templates</w:t>
       </w:r>
     </w:p>
@@ -587,8 +619,14 @@
           <w:ilvl w:val="0"/>
           <w:numId w:val="6"/>
         </w:numPr>
-      </w:pPr>
-      <w:r>
+        <w:rPr>
+          <w:highlight w:val="yellow"/>
+        </w:rPr>
+      </w:pPr>
+      <w:r>
+        <w:rPr>
+          <w:highlight w:val="yellow"/>
+        </w:rPr>
         <w:t>Implement downloadable content section (graphics/resources)</w:t>
       </w:r>
     </w:p>
@@ -713,8 +751,14 @@
           <w:ilvl w:val="0"/>
           <w:numId w:val="7"/>
         </w:numPr>
-      </w:pPr>
-      <w:r>
+        <w:rPr>
+          <w:strike/>
+        </w:rPr>
+      </w:pPr>
+      <w:r>
+        <w:rPr>
+          <w:strike/>
+        </w:rPr>
         <w:lastRenderedPageBreak/>
         <w:t>SEO optimization (meta tags, structured data)</w:t>
       </w:r>
@@ -1145,7 +1189,15 @@
       </w:r>
       <w:proofErr w:type="spellEnd"/>
       <w:r>
-        <w:t xml:space="preserve"> nuevo a callbacks Headless&gt;Customer API</w:t>
+        <w:t xml:space="preserve"> nuevo a </w:t>
+      </w:r>
+      <w:proofErr w:type="gramStart"/>
+      <w:r>
+        <w:t>callbacks</w:t>
+      </w:r>
+      <w:proofErr w:type="gramEnd"/>
+      <w:r>
+        <w:t xml:space="preserve"> Headless&gt;Customer API</w:t>
       </w:r>
       <w:r>
         <w:br/>

</xml_diff>